<commit_message>
Add Legal Aid claims tracker and refine forms
</commit_message>
<xml_diff>
--- a/templates/Application for parenting order.docx
+++ b/templates/Application for parenting order.docx
@@ -1230,7 +1230,7 @@
     <w:p>
       <w:pPr>
         <w:pStyle w:val="BodyText0"/>
-        <w:jc w:val="both"/>
+        <w:jc w:val="left"/>
         <w:rPr>
           <w:sz w:val="24"/>
           <w:lang w:val="en-AU"/>
@@ -1277,7 +1277,7 @@
     <w:p>
       <w:pPr>
         <w:pStyle w:val="BodyText0"/>
-        <w:jc w:val="both"/>
+        <w:jc w:val="left"/>
         <w:rPr>
           <w:sz w:val="24"/>
           <w:lang w:val="en-AU"/>
@@ -1354,7 +1354,7 @@
     <w:p>
       <w:pPr>
         <w:pStyle w:val="BodyText0"/>
-        <w:jc w:val="both"/>
+        <w:jc w:val="left"/>
         <w:rPr>
           <w:sz w:val="24"/>
           <w:lang w:val="en-GB"/>
@@ -1604,7 +1604,7 @@
     <w:p>
       <w:pPr>
         <w:pStyle w:val="BodyText0"/>
-        <w:jc w:val="both"/>
+        <w:jc w:val="left"/>
         <w:rPr>
           <w:sz w:val="24"/>
           <w:lang w:val="en-AU"/>
@@ -1636,6 +1636,7 @@
         <w:rPr>
           <w:b/>
         </w:rPr>
+        <w:jc w:val="left"/>
       </w:pPr>
       <w:r>
         <w:rPr>
@@ -1667,6 +1668,7 @@
           <w:b/>
           <w:lang w:val="en-AU"/>
         </w:rPr>
+        <w:jc w:val="left"/>
       </w:pPr>
       <w:r>
         <w:rPr>
@@ -1706,6 +1708,7 @@
           <w:b/>
           <w:lang w:val="en-AU"/>
         </w:rPr>
+        <w:jc w:val="left"/>
       </w:pPr>
       <w:r>
         <w:rPr>

</xml_diff>